<commit_message>
Added grouping and task reordering, and updated the documentation
</commit_message>
<xml_diff>
--- a/documentation/word/02_Вимоги_та_користувацькі_сценарії.docx
+++ b/documentation/word/02_Вимоги_та_користувацькі_сценарії.docx
@@ -39884,6 +39884,53 @@
         <w:spacing w:after="40"/>
       </w:pPr>
     </w:p>
+    <w:p>
+      <w:pPr>
+        <w:pStyle w:val="1"/>
+      </w:pPr>
+      <w:r>
+        <w:t>Сценарії групування і впорядкування скоупу</w:t>
+      </w:r>
+    </w:p>
+    <w:p>
+      <w:pPr>
+        <w:pStyle w:val="21"/>
+      </w:pPr>
+      <w:r>
+        <w:t>Основні сценарії</w:t>
+      </w:r>
+    </w:p>
+    <w:p>
+      <w:r>
+        <w:t>Користувач може створити групу з поточного завдання, призначити завдання наявній групі, повернути його до «Без групи», перейменувати або розформувати групу та змінити порядок стрілками. Зміни застосовуються разом зі збереженням квартальної картки.</w:t>
+      </w:r>
+    </w:p>
+    <w:p>
+      <w:pPr>
+        <w:pStyle w:val="21"/>
+      </w:pPr>
+      <w:r>
+        <w:t>Перенесення і копіювання</w:t>
+      </w:r>
+    </w:p>
+    <w:p>
+      <w:r>
+        <w:t>Завдання без групи додається в кінець цільового скоупу. Для згрупованого завдання система знаходить групу з тим самим lineage_id або створює її, додає завдання в кінець блоку та видаляє порожню вихідну групу після перенесення. Обмеження для виконаних завдань не обходяться груповими діями.</w:t>
+      </w:r>
+    </w:p>
+    <w:p>
+      <w:pPr>
+        <w:pStyle w:val="21"/>
+      </w:pPr>
+      <w:r>
+        <w:t>Збереження наявних даних</w:t>
+      </w:r>
+    </w:p>
+    <w:p>
+      <w:r>
+        <w:t>Міграція не видаляє і не змінює тексти, статуси, ваги, виконавців, lineage та revisions наявних завдань. Вони залишаються без груп і отримують порядок за created_at та id.</w:t>
+      </w:r>
+    </w:p>
     <w:sectPr>
       <w:headerReference w:type="default" r:id="rId8"/>
       <w:footerReference w:type="default" r:id="rId9"/>

</xml_diff>